<commit_message>
fix: apply Festival Foods correction to TXT and DOCX resume files
The block replace for the retail role silently missed in the plain-text
master (bullets were split differently than in the PDF script), so the
TXT and the DOCX generated from it still carried Operations Lead.
PDF and HTML were correct. Regenerated DOCX from the fixed TXT and
verified all four formats: Festival Foods present, Operations Lead gone.
</commit_message>
<xml_diff>
--- a/frontend/public/Carter-Moyer-Resume.docx
+++ b/frontend/public/Carter-Moyer-Resume.docx
@@ -198,7 +198,7 @@
         <w:rPr>
           <w:b/>
         </w:rPr>
-        <w:t>Operations Lead, Inventory Management, Retail Operations</w:t>
+        <w:t>Dairy Clerk, Festival Foods, Fond du Lac, WI</w:t>
       </w:r>
     </w:p>
     <w:p>
@@ -212,7 +212,7 @@
         <w:spacing w:after="20"/>
       </w:pPr>
       <w:r>
-        <w:t>Managed high-throughput daily operations and inventory workflows over nearly 4 years of continuous employment while completing a Computer Science degree</w:t>
+        <w:t>Managed time-sensitive daily inventory logistics and operational workflows over nearly 4 years of continuous employment while completing a Computer Science degree</w:t>
       </w:r>
     </w:p>
     <w:p>
@@ -221,16 +221,7 @@
         <w:spacing w:after="20"/>
       </w:pPr>
       <w:r>
-        <w:t>Onboarded and mentored new personnel on operational standards and communication protocols</w:t>
-      </w:r>
-    </w:p>
-    <w:p>
-      <w:pPr>
-        <w:pStyle w:val="ListBullet"/>
-        <w:spacing w:after="20"/>
-      </w:pPr>
-      <w:r>
-        <w:t>Built systems for resolving logistical issues and operational bottlenecks, improving workload efficiency</w:t>
+        <w:t>Formulated on-the-job training materials to onboard and mentor incoming personnel on compliance and service standards, and resolved complex customer inquiries</w:t>
       </w:r>
     </w:p>
     <w:p>

</xml_diff>

<commit_message>
fix: remove Festival Foods from software resume per source video
The video transcript (recovered via youtubetotranscript.com) states
restaurant/retail experience can itself trigger ATS rejection as a
social-class signal. The software resume now lists only Phoenix
Websites AI and Outlier; a general version keeping Festival Foods is
saved separately in the Jobs workspace for non-software applications.
</commit_message>
<xml_diff>
--- a/frontend/public/Carter-Moyer-Resume.docx
+++ b/frontend/public/Carter-Moyer-Resume.docx
@@ -191,37 +191,6 @@
       </w:pPr>
       <w:r>
         <w:t>Evaluate and debug complex code-related tasks, algorithms, and AI research prompts to improve large language model accuracy, assessing LLM outputs for logic, efficiency, and syntax correctness</w:t>
-      </w:r>
-    </w:p>
-    <w:p>
-      <w:r>
-        <w:rPr>
-          <w:b/>
-        </w:rPr>
-        <w:t>Dairy Clerk, Festival Foods, Fond du Lac, WI</w:t>
-      </w:r>
-    </w:p>
-    <w:p>
-      <w:r>
-        <w:t>June 2022 - March 2026</w:t>
-      </w:r>
-    </w:p>
-    <w:p>
-      <w:pPr>
-        <w:pStyle w:val="ListBullet"/>
-        <w:spacing w:after="20"/>
-      </w:pPr>
-      <w:r>
-        <w:t>Managed time-sensitive daily inventory logistics and operational workflows over nearly 4 years of continuous employment while completing a Computer Science degree</w:t>
-      </w:r>
-    </w:p>
-    <w:p>
-      <w:pPr>
-        <w:pStyle w:val="ListBullet"/>
-        <w:spacing w:after="20"/>
-      </w:pPr>
-      <w:r>
-        <w:t>Formulated on-the-job training materials to onboard and mentor incoming personnel on compliance and service standards, and resolved complex customer inquiries</w:t>
       </w:r>
     </w:p>
     <w:p>

</xml_diff>

<commit_message>
fix: honest project framing (personal projects, still strong) and resume updates
Per Carter: the portfolio projects are personal projects, not client
work. Cards now say so plainly while keeping the engineering detail:
removed fake scale claims (peak booking loads, 100% integrity),
client-concept language, and enterprise deployment framing. The
business outreach system is framed as built for his own business.

Resume: summary and shipped-apps bullet no longer claim the 10+
apps were all for real clients (client work plus production-grade
personal projects). Appointment Booker: demo grade removed
everywhere, replaced with the team's successful delivery, plus a new
bullet for the similar appointment booking site Carter built entirely
solo the previous year for a web development class (team and solo
proof).
</commit_message>
<xml_diff>
--- a/frontend/public/Carter-Moyer-Resume.docx
+++ b/frontend/public/Carter-Moyer-Resume.docx
@@ -75,7 +75,7 @@
     </w:p>
     <w:p>
       <w:r>
-        <w:t>Full-Stack Software Engineer and Computer Science graduate (B.S., December 2026) who has already shipped 10+ live production applications for real clients and users, not only coursework. Founder of Phoenix Websites AI, a web development business delivering custom websites, SaaS portals, dashboards, and AI products with authentication, Stripe payments, and automated contracts. AI Trainer at Outlier evaluating and debugging code and LLM outputs. Specialized in the MEAN stack (MongoDB, Express, Angular, Node.js) and modern JavaScript and TypeScript across React and Next.js. Uses AI as an accelerator while personally auditing and testing every line that ships.</w:t>
+        <w:t>Full-Stack Software Engineer and Computer Science graduate (B.S., December 2026) who has already shipped 10+ live, deployed applications: client work through his own business plus full-scale personal projects built to production standards, not only coursework. Founder of Phoenix Websites AI, a web development business delivering custom websites, SaaS portals, dashboards, and AI products with authentication, Stripe payments, and automated contracts. AI Trainer at Outlier evaluating and debugging code and LLM outputs. Specialized in the MEAN stack (MongoDB, Express, Angular, Node.js) and modern JavaScript and TypeScript across React and Next.js. Uses AI as an accelerator while personally auditing and testing every line that ships.</w:t>
       </w:r>
     </w:p>
     <w:p>
@@ -106,7 +106,7 @@
     </w:p>
     <w:p>
       <w:r>
-        <w:t>Relevant coursework: Software Engineering (MEAN-stack team project, Demo 1 scored 10/10), Full-Stack Web Development, Database Systems, Data Structures and Algorithms, Operating Systems, Object-Oriented Design, Compilers, Automata Theory</w:t>
+        <w:t>Relevant coursework: Software Engineering (MEAN-stack team project), Full-Stack Web Development, Database Systems, Data Structures and Algorithms, Operating Systems, Object-Oriented Design, Compilers, Automata Theory</w:t>
       </w:r>
     </w:p>
     <w:p>
@@ -159,7 +159,7 @@
         <w:spacing w:after="20"/>
       </w:pPr>
       <w:r>
-        <w:t>Shipped 10+ live production applications end to end: requirements, system design, clean development, testing, CI/CD deployment, and support, usually in 2 to 5 weeks per client site</w:t>
+        <w:t>Shipped 10+ live applications end to end (client sites through the business plus production-grade personal projects, all publicly deployed): requirements, system design, clean development, testing, CI/CD deployment, and support, with client sites typically delivered in 2 to 5 weeks</w:t>
       </w:r>
     </w:p>
     <w:p>
@@ -278,7 +278,7 @@
         <w:spacing w:after="20"/>
       </w:pPr>
       <w:r>
-        <w:t>Worked in a 4-person Agile team to design and build an appointment booking application; first professor demo scored 10/10</w:t>
+        <w:t>Worked in a 4-person Agile team to design, build, and successfully deliver an appointment booking application, splitting the full stack across the team and integrating it into one working product</w:t>
       </w:r>
     </w:p>
     <w:p>
@@ -288,6 +288,15 @@
       </w:pPr>
       <w:r>
         <w:t>Designed one account per person with both customer and provider views, seeded administrator access, and duplicate account handling</w:t>
+      </w:r>
+    </w:p>
+    <w:p>
+      <w:pPr>
+        <w:pStyle w:val="ListBullet"/>
+        <w:spacing w:after="20"/>
+      </w:pPr>
+      <w:r>
+        <w:t>Also built a similar appointment booking website entirely on my own the previous year for a web development class, owning the whole stack solo from database to UI: the same kind of system delivered both independently and as part of a team</w:t>
       </w:r>
     </w:p>
     <w:p>

</xml_diff>

<commit_message>
feat: evolutionary development model on Appointment Booker (team and solo)
Per Carter: the SE4 team used an evolutionary development model, and
his solo appointment booking site for his web development class the
previous year used the same model and was the same kind of project.
Resume updated everywhere: project meta line, team bullet, solo
bullet, and the skills line now includes Evolutionary Development.
</commit_message>
<xml_diff>
--- a/frontend/public/Carter-Moyer-Resume.docx
+++ b/frontend/public/Carter-Moyer-Resume.docx
@@ -269,7 +269,7 @@
     </w:p>
     <w:p>
       <w:r>
-        <w:t>MongoDB, Express, Angular, Node.js (MEAN Stack), Agile, Role-Based Access Control</w:t>
+        <w:t>MongoDB, Express, Angular, Node.js (MEAN Stack), Evolutionary Development Model, Role-Based Access Control</w:t>
       </w:r>
     </w:p>
     <w:p>
@@ -278,7 +278,7 @@
         <w:spacing w:after="20"/>
       </w:pPr>
       <w:r>
-        <w:t>Worked in a 4-person Agile team to design, build, and successfully deliver an appointment booking application, splitting the full stack across the team and integrating it into one working product</w:t>
+        <w:t>Built an appointment booking application in a 4-person team using an evolutionary development model, evolving a working prototype through successive versions and feedback cycles into the successfully delivered final product, with the full stack split across the team</w:t>
       </w:r>
     </w:p>
     <w:p>
@@ -296,7 +296,7 @@
         <w:spacing w:after="20"/>
       </w:pPr>
       <w:r>
-        <w:t>Also built a similar appointment booking website entirely on my own the previous year for a web development class, owning the whole stack solo from database to UI: the same kind of system delivered both independently and as part of a team</w:t>
+        <w:t>Also built the same kind of appointment booking website entirely on my own the previous year for a web development class, using the same evolutionary model and owning the whole stack solo from database to UI: the same system delivered both independently and as part of a team</w:t>
       </w:r>
     </w:p>
     <w:p>
@@ -329,7 +329,7 @@
     </w:p>
     <w:p>
       <w:r>
-        <w:t>Engineering Practice: Object-Oriented Programming (OOP), Data Structures and Algorithms, System Design, Software Development Life Cycle (SDLC), Agile, Automated Testing, Unit Testing, Code Review, Compilers, Automata Theory, DevSecOps, Authentication, Role-Based Access Control, AES-256 Encryption</w:t>
+        <w:t>Engineering Practice: Object-Oriented Programming (OOP), Data Structures and Algorithms, System Design, Software Development Life Cycle (SDLC), Agile, Evolutionary Development, Automated Testing, Unit Testing, Code Review, Compilers, Automata Theory, DevSecOps, Authentication, Role-Based Access Control, AES-256 Encryption</w:t>
       </w:r>
     </w:p>
     <w:p>

</xml_diff>